<commit_message>
Remove highlights from the 2026-10-19 AIGC resume
Co-Authored-By: Claude Opus 5.5 <noreply@anthropic.com>
Claude-Session: https://claude.ai/code/session_014b3Ueq5gn52GSK2xeWEbYh
</commit_message>
<xml_diff>
--- a/cv/Qirui_-_resume_2026-10-19_AIGC.docx
+++ b/cv/Qirui_-_resume_2026-10-19_AIGC.docx
@@ -441,7 +441,6 @@
                                 <w:rFonts w:ascii="Arial Narrow" w:hAnsi="Arial Narrow"/>
                                 <w:sz w:val="18"/>
                                 <w:szCs w:val="18"/>
-                                <w:highlight w:val="yellow"/>
                               </w:rPr>
                               <w:t xml:space="preserve">Built the Singapore lab from the ground up (40 members); currently leads a 5-person core research team. </w:t>
                             </w:r>
@@ -1347,7 +1346,6 @@
                           <w:rFonts w:ascii="Arial Narrow" w:hAnsi="Arial Narrow"/>
                           <w:sz w:val="18"/>
                           <w:szCs w:val="18"/>
-                          <w:highlight w:val="yellow"/>
                         </w:rPr>
                         <w:t xml:space="preserve">Built the Singapore lab from the ground up (40 members); currently leads a 5-person core research team. </w:t>
                       </w:r>
@@ -2260,7 +2258,6 @@
                               <w:rPr>
                                 <w:sz w:val="24"/>
                                 <w:szCs w:val="24"/>
-                                <w:highlight w:val="yellow"/>
                               </w:rPr>
                               <w:t xml:space="preserve">Built the Singapore lab from the ground up to 40 members; currently lead a 5-person core team on generative models and world models.</w:t>
                             </w:r>
@@ -2955,7 +2952,6 @@
                         <w:rPr>
                           <w:sz w:val="24"/>
                           <w:szCs w:val="24"/>
-                          <w:highlight w:val="yellow"/>
                         </w:rPr>
                         <w:t xml:space="preserve">Built the Singapore lab from the ground up to 40 members; currently lead a 5-person core team on generative models and world models.</w:t>
                       </w:r>
@@ -3874,9 +3870,8 @@
                             <w:r>
                               <w:rPr>
                                 <w:rFonts w:cs="Arial"/>
-                                <w:highlight w:val="yellow"/>
-                              </w:rPr>
-                              <w:t xml:space="preserve">Recent work on efficient unified multimodal models and hybrid-LLM serving under review / in preparation for ICLR 2027 and ACL 2027.</w:t>
+                              </w:rPr>
+                              <w:t xml:space="preserve">Recent work on efficient unified multimodal models and hybrid-LLM serving targeting ICLR 2027 and ACL 2027.</w:t>
                             </w:r>
                           </w:p>
                           <w:p>
@@ -4806,9 +4801,8 @@
                       <w:r>
                         <w:rPr>
                           <w:rFonts w:cs="Arial"/>
-                          <w:highlight w:val="yellow"/>
-                        </w:rPr>
-                        <w:t xml:space="preserve">Recent work on efficient unified multimodal models and hybrid-LLM serving under review / in preparation for ICLR 2027 and ACL 2027.</w:t>
+                        </w:rPr>
+                        <w:t xml:space="preserve">Recent work on efficient unified multimodal models and hybrid-LLM serving targeting ICLR 2027 and ACL 2027.</w:t>
                       </w:r>
                     </w:p>
                     <w:p>

</xml_diff>

<commit_message>
Clarify lab founding and current team size in AIGC resume
Co-Authored-By: Claude Opus 5.5 <noreply@anthropic.com>
Claude-Session: https://claude.ai/code/session_014b3Ueq5gn52GSK2xeWEbYh
</commit_message>
<xml_diff>
--- a/cv/Qirui_-_resume_2026-10-19_AIGC.docx
+++ b/cv/Qirui_-_resume_2026-10-19_AIGC.docx
@@ -442,7 +442,7 @@
                                 <w:sz w:val="18"/>
                                 <w:szCs w:val="18"/>
                               </w:rPr>
-                              <w:t xml:space="preserve">Built the Singapore lab from the ground up (40 members); currently leads a 5-person core research team. </w:t>
+                              <w:t xml:space="preserve">Founded the Singapore lab (Singapore region: 40 staff), later handed it over to a Chief Expert; now leads a 5-person core research team. </w:t>
                             </w:r>
                             <w:r>
                               <w:rPr>
@@ -1347,7 +1347,7 @@
                           <w:sz w:val="18"/>
                           <w:szCs w:val="18"/>
                         </w:rPr>
-                        <w:t xml:space="preserve">Built the Singapore lab from the ground up (40 members); currently leads a 5-person core research team. </w:t>
+                        <w:t xml:space="preserve">Founded the Singapore lab (Singapore region: 40 staff), later handed it over to a Chief Expert; now leads a 5-person core research team. </w:t>
                       </w:r>
                       <w:r>
                         <w:rPr>
@@ -2259,7 +2259,7 @@
                                 <w:sz w:val="24"/>
                                 <w:szCs w:val="24"/>
                               </w:rPr>
-                              <w:t xml:space="preserve">Built the Singapore lab from the ground up to 40 members; currently lead a 5-person core team on generative models and world models.</w:t>
+                              <w:t xml:space="preserve">Founded and built the Singapore lab from the ground up (Singapore region: 40 staff), then handed it over to a Chief Expert; currently lead a 5-person core team on generative models and world models.</w:t>
                             </w:r>
                           </w:p>
                           <w:p>
@@ -2953,7 +2953,7 @@
                           <w:sz w:val="24"/>
                           <w:szCs w:val="24"/>
                         </w:rPr>
-                        <w:t xml:space="preserve">Built the Singapore lab from the ground up to 40 members; currently lead a 5-person core team on generative models and world models.</w:t>
+                        <w:t xml:space="preserve">Founded and built the Singapore lab from the ground up (Singapore region: 40 staff), then handed it over to a Chief Expert; currently lead a 5-person core team on generative models and world models.</w:t>
                       </w:r>
                     </w:p>
                     <w:p>

</xml_diff>